<commit_message>
RPS Opto: fix header tabel mingguan terpisah page break (halaman 7/8)
Baris header tabel mingguan detail (label gabungan + sub-label + nomor
kolom) sempat terpisah oleh page break -- baris pertama sendirian di
akhir halaman 7, sisanya + data pindah ke halaman 8. Fix: tambah
w:keepNext ke semua paragraf di 3 baris header supaya seluruh blok
pindah bersama sebagai satu unit ke halaman 8.

Co-Authored-By: Claude Sonnet 5 <noreply@anthropic.com>
Claude-Session: https://claude.ai/code/session_01MRPE2Wfn5ruEpMsNER92uG
</commit_message>
<xml_diff>
--- a/Optimalisasi-dan-Automasi/Attributes/RPS Optimalisasi dan Otomasi.docx
+++ b/Optimalisasi-dan-Automasi/Attributes/RPS Optimalisasi dan Otomasi.docx
@@ -16548,6 +16548,7 @@
           </w:tcPr>
           <w:p>
             <w:pPr>
+              <w:keepNext/>
               <w:jc w:val="center"/>
               <w:rPr>
                 <w:rFonts w:ascii="Times New Roman" w:eastAsia="Arial" w:hAnsi="Times New Roman" w:cs="Times New Roman"/>
@@ -16560,6 +16561,7 @@
           </w:p>
           <w:p>
             <w:pPr>
+              <w:keepNext/>
               <w:jc w:val="center"/>
               <w:rPr>
                 <w:rFonts w:ascii="Times New Roman" w:eastAsia="Arial" w:hAnsi="Times New Roman" w:cs="Times New Roman"/>
@@ -16590,6 +16592,7 @@
           </w:tcPr>
           <w:p>
             <w:pPr>
+              <w:keepNext/>
               <w:jc w:val="center"/>
               <w:rPr>
                 <w:rFonts w:ascii="Times New Roman" w:eastAsia="Arial" w:hAnsi="Times New Roman" w:cs="Times New Roman"/>
@@ -16612,6 +16615,7 @@
           </w:p>
           <w:p>
             <w:pPr>
+              <w:keepNext/>
               <w:jc w:val="center"/>
               <w:rPr>
                 <w:rFonts w:ascii="Times New Roman" w:eastAsia="Arial" w:hAnsi="Times New Roman" w:cs="Times New Roman"/>
@@ -16642,6 +16646,7 @@
           </w:tcPr>
           <w:p>
             <w:pPr>
+              <w:keepNext/>
               <w:jc w:val="center"/>
               <w:rPr>
                 <w:rFonts w:ascii="Times New Roman" w:eastAsia="Arial" w:hAnsi="Times New Roman" w:cs="Times New Roman"/>
@@ -16672,6 +16677,7 @@
           </w:tcPr>
           <w:p>
             <w:pPr>
+              <w:keepNext/>
               <w:jc w:val="center"/>
               <w:rPr>
                 <w:rFonts w:ascii="Times New Roman" w:eastAsia="Arial" w:hAnsi="Times New Roman" w:cs="Times New Roman"/>
@@ -16694,6 +16700,7 @@
           </w:p>
           <w:p>
             <w:pPr>
+              <w:keepNext/>
               <w:jc w:val="center"/>
               <w:rPr>
                 <w:rFonts w:ascii="Times New Roman" w:eastAsia="Arial" w:hAnsi="Times New Roman" w:cs="Times New Roman"/>
@@ -16723,6 +16730,7 @@
           </w:tcPr>
           <w:p>
             <w:pPr>
+              <w:keepNext/>
               <w:jc w:val="center"/>
               <w:rPr>
                 <w:rFonts w:ascii="Times New Roman" w:eastAsia="Arial" w:hAnsi="Times New Roman" w:cs="Times New Roman"/>
@@ -16745,6 +16753,7 @@
           </w:p>
           <w:p>
             <w:pPr>
+              <w:keepNext/>
               <w:jc w:val="center"/>
               <w:rPr>
                 <w:rFonts w:ascii="Times New Roman" w:eastAsia="Arial" w:hAnsi="Times New Roman" w:cs="Times New Roman"/>
@@ -16775,6 +16784,7 @@
           </w:tcPr>
           <w:p>
             <w:pPr>
+              <w:keepNext/>
               <w:jc w:val="center"/>
               <w:rPr>
                 <w:rFonts w:ascii="Times New Roman" w:eastAsia="Arial" w:hAnsi="Times New Roman" w:cs="Times New Roman"/>
@@ -16797,6 +16807,7 @@
           </w:p>
           <w:p>
             <w:pPr>
+              <w:keepNext/>
               <w:jc w:val="center"/>
               <w:rPr>
                 <w:rFonts w:ascii="Times New Roman" w:eastAsia="Arial" w:hAnsi="Times New Roman" w:cs="Times New Roman"/>
@@ -16831,6 +16842,7 @@
           </w:tcPr>
           <w:p>
             <w:pPr>
+              <w:keepNext/>
               <w:widowControl w:val="0"/>
               <w:pBdr>
                 <w:top w:val="nil"/>
@@ -16858,6 +16870,7 @@
           </w:tcPr>
           <w:p>
             <w:pPr>
+              <w:keepNext/>
               <w:widowControl w:val="0"/>
               <w:pBdr>
                 <w:top w:val="nil"/>
@@ -16884,6 +16897,7 @@
           </w:tcPr>
           <w:p>
             <w:pPr>
+              <w:keepNext/>
               <w:jc w:val="center"/>
               <w:rPr>
                 <w:rFonts w:ascii="Times New Roman" w:eastAsia="Arial" w:hAnsi="Times New Roman" w:cs="Times New Roman"/>
@@ -16913,6 +16927,7 @@
           </w:tcPr>
           <w:p>
             <w:pPr>
+              <w:keepNext/>
               <w:jc w:val="center"/>
               <w:rPr>
                 <w:rFonts w:ascii="Times New Roman" w:eastAsia="Arial" w:hAnsi="Times New Roman" w:cs="Times New Roman"/>
@@ -16942,6 +16957,7 @@
           </w:tcPr>
           <w:p>
             <w:pPr>
+              <w:keepNext/>
               <w:jc w:val="center"/>
               <w:rPr>
                 <w:rFonts w:ascii="Times New Roman" w:eastAsia="Arial" w:hAnsi="Times New Roman" w:cs="Times New Roman"/>
@@ -16971,6 +16987,7 @@
           </w:tcPr>
           <w:p>
             <w:pPr>
+              <w:keepNext/>
               <w:jc w:val="center"/>
               <w:rPr>
                 <w:rFonts w:ascii="Times New Roman" w:eastAsia="Arial" w:hAnsi="Times New Roman" w:cs="Times New Roman"/>
@@ -17001,6 +17018,7 @@
           </w:tcPr>
           <w:p>
             <w:pPr>
+              <w:keepNext/>
               <w:widowControl w:val="0"/>
               <w:pBdr>
                 <w:top w:val="nil"/>
@@ -17030,6 +17048,7 @@
           </w:tcPr>
           <w:p>
             <w:pPr>
+              <w:keepNext/>
               <w:widowControl w:val="0"/>
               <w:pBdr>
                 <w:top w:val="nil"/>
@@ -17060,6 +17079,7 @@
           </w:tcPr>
           <w:p>
             <w:pPr>
+              <w:keepNext/>
               <w:jc w:val="center"/>
               <w:rPr>
                 <w:rFonts w:ascii="Times New Roman" w:eastAsia="Arial" w:hAnsi="Times New Roman" w:cs="Times New Roman"/>
@@ -17087,6 +17107,7 @@
           </w:tcPr>
           <w:p>
             <w:pPr>
+              <w:keepNext/>
               <w:jc w:val="center"/>
               <w:rPr>
                 <w:rFonts w:ascii="Times New Roman" w:eastAsia="Arial" w:hAnsi="Times New Roman" w:cs="Times New Roman"/>
@@ -17114,6 +17135,7 @@
           </w:tcPr>
           <w:p>
             <w:pPr>
+              <w:keepNext/>
               <w:jc w:val="center"/>
               <w:rPr>
                 <w:rFonts w:ascii="Times New Roman" w:eastAsia="Arial" w:hAnsi="Times New Roman" w:cs="Times New Roman"/>
@@ -17141,6 +17163,7 @@
           </w:tcPr>
           <w:p>
             <w:pPr>
+              <w:keepNext/>
               <w:jc w:val="center"/>
               <w:rPr>
                 <w:rFonts w:ascii="Times New Roman" w:eastAsia="Arial" w:hAnsi="Times New Roman" w:cs="Times New Roman"/>
@@ -17168,6 +17191,7 @@
           </w:tcPr>
           <w:p>
             <w:pPr>
+              <w:keepNext/>
               <w:jc w:val="center"/>
               <w:rPr>
                 <w:rFonts w:ascii="Times New Roman" w:eastAsia="Arial" w:hAnsi="Times New Roman" w:cs="Times New Roman"/>
@@ -17195,6 +17219,7 @@
           </w:tcPr>
           <w:p>
             <w:pPr>
+              <w:keepNext/>
               <w:jc w:val="center"/>
               <w:rPr>
                 <w:rFonts w:ascii="Times New Roman" w:eastAsia="Arial" w:hAnsi="Times New Roman" w:cs="Times New Roman"/>
@@ -17222,6 +17247,7 @@
           </w:tcPr>
           <w:p>
             <w:pPr>
+              <w:keepNext/>
               <w:jc w:val="center"/>
               <w:rPr>
                 <w:rFonts w:ascii="Times New Roman" w:eastAsia="Arial" w:hAnsi="Times New Roman" w:cs="Times New Roman"/>
@@ -17249,6 +17275,7 @@
           </w:tcPr>
           <w:p>
             <w:pPr>
+              <w:keepNext/>
               <w:jc w:val="center"/>
               <w:rPr>
                 <w:rFonts w:ascii="Times New Roman" w:eastAsia="Arial" w:hAnsi="Times New Roman" w:cs="Times New Roman"/>

</xml_diff>

<commit_message>
RPS Opto: fix header tabel mingguan terpisah page break (halaman 7/8) (#657)
Baris header tabel mingguan detail (label gabungan + sub-label + nomor
kolom) sempat terpisah oleh page break -- baris pertama sendirian di
akhir halaman 7, sisanya + data pindah ke halaman 8. Fix: tambah
w:keepNext ke semua paragraf di 3 baris header supaya seluruh blok
pindah bersama sebagai satu unit ke halaman 8.


Claude-Session: https://claude.ai/code/session_01MRPE2Wfn5ruEpMsNER92uG

Co-authored-by: Claude <noreply@anthropic.com>
</commit_message>
<xml_diff>
--- a/Optimalisasi-dan-Automasi/Attributes/RPS Optimalisasi dan Otomasi.docx
+++ b/Optimalisasi-dan-Automasi/Attributes/RPS Optimalisasi dan Otomasi.docx
@@ -16548,6 +16548,7 @@
           </w:tcPr>
           <w:p>
             <w:pPr>
+              <w:keepNext/>
               <w:jc w:val="center"/>
               <w:rPr>
                 <w:rFonts w:ascii="Times New Roman" w:eastAsia="Arial" w:hAnsi="Times New Roman" w:cs="Times New Roman"/>
@@ -16560,6 +16561,7 @@
           </w:p>
           <w:p>
             <w:pPr>
+              <w:keepNext/>
               <w:jc w:val="center"/>
               <w:rPr>
                 <w:rFonts w:ascii="Times New Roman" w:eastAsia="Arial" w:hAnsi="Times New Roman" w:cs="Times New Roman"/>
@@ -16590,6 +16592,7 @@
           </w:tcPr>
           <w:p>
             <w:pPr>
+              <w:keepNext/>
               <w:jc w:val="center"/>
               <w:rPr>
                 <w:rFonts w:ascii="Times New Roman" w:eastAsia="Arial" w:hAnsi="Times New Roman" w:cs="Times New Roman"/>
@@ -16612,6 +16615,7 @@
           </w:p>
           <w:p>
             <w:pPr>
+              <w:keepNext/>
               <w:jc w:val="center"/>
               <w:rPr>
                 <w:rFonts w:ascii="Times New Roman" w:eastAsia="Arial" w:hAnsi="Times New Roman" w:cs="Times New Roman"/>
@@ -16642,6 +16646,7 @@
           </w:tcPr>
           <w:p>
             <w:pPr>
+              <w:keepNext/>
               <w:jc w:val="center"/>
               <w:rPr>
                 <w:rFonts w:ascii="Times New Roman" w:eastAsia="Arial" w:hAnsi="Times New Roman" w:cs="Times New Roman"/>
@@ -16672,6 +16677,7 @@
           </w:tcPr>
           <w:p>
             <w:pPr>
+              <w:keepNext/>
               <w:jc w:val="center"/>
               <w:rPr>
                 <w:rFonts w:ascii="Times New Roman" w:eastAsia="Arial" w:hAnsi="Times New Roman" w:cs="Times New Roman"/>
@@ -16694,6 +16700,7 @@
           </w:p>
           <w:p>
             <w:pPr>
+              <w:keepNext/>
               <w:jc w:val="center"/>
               <w:rPr>
                 <w:rFonts w:ascii="Times New Roman" w:eastAsia="Arial" w:hAnsi="Times New Roman" w:cs="Times New Roman"/>
@@ -16723,6 +16730,7 @@
           </w:tcPr>
           <w:p>
             <w:pPr>
+              <w:keepNext/>
               <w:jc w:val="center"/>
               <w:rPr>
                 <w:rFonts w:ascii="Times New Roman" w:eastAsia="Arial" w:hAnsi="Times New Roman" w:cs="Times New Roman"/>
@@ -16745,6 +16753,7 @@
           </w:p>
           <w:p>
             <w:pPr>
+              <w:keepNext/>
               <w:jc w:val="center"/>
               <w:rPr>
                 <w:rFonts w:ascii="Times New Roman" w:eastAsia="Arial" w:hAnsi="Times New Roman" w:cs="Times New Roman"/>
@@ -16775,6 +16784,7 @@
           </w:tcPr>
           <w:p>
             <w:pPr>
+              <w:keepNext/>
               <w:jc w:val="center"/>
               <w:rPr>
                 <w:rFonts w:ascii="Times New Roman" w:eastAsia="Arial" w:hAnsi="Times New Roman" w:cs="Times New Roman"/>
@@ -16797,6 +16807,7 @@
           </w:p>
           <w:p>
             <w:pPr>
+              <w:keepNext/>
               <w:jc w:val="center"/>
               <w:rPr>
                 <w:rFonts w:ascii="Times New Roman" w:eastAsia="Arial" w:hAnsi="Times New Roman" w:cs="Times New Roman"/>
@@ -16831,6 +16842,7 @@
           </w:tcPr>
           <w:p>
             <w:pPr>
+              <w:keepNext/>
               <w:widowControl w:val="0"/>
               <w:pBdr>
                 <w:top w:val="nil"/>
@@ -16858,6 +16870,7 @@
           </w:tcPr>
           <w:p>
             <w:pPr>
+              <w:keepNext/>
               <w:widowControl w:val="0"/>
               <w:pBdr>
                 <w:top w:val="nil"/>
@@ -16884,6 +16897,7 @@
           </w:tcPr>
           <w:p>
             <w:pPr>
+              <w:keepNext/>
               <w:jc w:val="center"/>
               <w:rPr>
                 <w:rFonts w:ascii="Times New Roman" w:eastAsia="Arial" w:hAnsi="Times New Roman" w:cs="Times New Roman"/>
@@ -16913,6 +16927,7 @@
           </w:tcPr>
           <w:p>
             <w:pPr>
+              <w:keepNext/>
               <w:jc w:val="center"/>
               <w:rPr>
                 <w:rFonts w:ascii="Times New Roman" w:eastAsia="Arial" w:hAnsi="Times New Roman" w:cs="Times New Roman"/>
@@ -16942,6 +16957,7 @@
           </w:tcPr>
           <w:p>
             <w:pPr>
+              <w:keepNext/>
               <w:jc w:val="center"/>
               <w:rPr>
                 <w:rFonts w:ascii="Times New Roman" w:eastAsia="Arial" w:hAnsi="Times New Roman" w:cs="Times New Roman"/>
@@ -16971,6 +16987,7 @@
           </w:tcPr>
           <w:p>
             <w:pPr>
+              <w:keepNext/>
               <w:jc w:val="center"/>
               <w:rPr>
                 <w:rFonts w:ascii="Times New Roman" w:eastAsia="Arial" w:hAnsi="Times New Roman" w:cs="Times New Roman"/>
@@ -17001,6 +17018,7 @@
           </w:tcPr>
           <w:p>
             <w:pPr>
+              <w:keepNext/>
               <w:widowControl w:val="0"/>
               <w:pBdr>
                 <w:top w:val="nil"/>
@@ -17030,6 +17048,7 @@
           </w:tcPr>
           <w:p>
             <w:pPr>
+              <w:keepNext/>
               <w:widowControl w:val="0"/>
               <w:pBdr>
                 <w:top w:val="nil"/>
@@ -17060,6 +17079,7 @@
           </w:tcPr>
           <w:p>
             <w:pPr>
+              <w:keepNext/>
               <w:jc w:val="center"/>
               <w:rPr>
                 <w:rFonts w:ascii="Times New Roman" w:eastAsia="Arial" w:hAnsi="Times New Roman" w:cs="Times New Roman"/>
@@ -17087,6 +17107,7 @@
           </w:tcPr>
           <w:p>
             <w:pPr>
+              <w:keepNext/>
               <w:jc w:val="center"/>
               <w:rPr>
                 <w:rFonts w:ascii="Times New Roman" w:eastAsia="Arial" w:hAnsi="Times New Roman" w:cs="Times New Roman"/>
@@ -17114,6 +17135,7 @@
           </w:tcPr>
           <w:p>
             <w:pPr>
+              <w:keepNext/>
               <w:jc w:val="center"/>
               <w:rPr>
                 <w:rFonts w:ascii="Times New Roman" w:eastAsia="Arial" w:hAnsi="Times New Roman" w:cs="Times New Roman"/>
@@ -17141,6 +17163,7 @@
           </w:tcPr>
           <w:p>
             <w:pPr>
+              <w:keepNext/>
               <w:jc w:val="center"/>
               <w:rPr>
                 <w:rFonts w:ascii="Times New Roman" w:eastAsia="Arial" w:hAnsi="Times New Roman" w:cs="Times New Roman"/>
@@ -17168,6 +17191,7 @@
           </w:tcPr>
           <w:p>
             <w:pPr>
+              <w:keepNext/>
               <w:jc w:val="center"/>
               <w:rPr>
                 <w:rFonts w:ascii="Times New Roman" w:eastAsia="Arial" w:hAnsi="Times New Roman" w:cs="Times New Roman"/>
@@ -17195,6 +17219,7 @@
           </w:tcPr>
           <w:p>
             <w:pPr>
+              <w:keepNext/>
               <w:jc w:val="center"/>
               <w:rPr>
                 <w:rFonts w:ascii="Times New Roman" w:eastAsia="Arial" w:hAnsi="Times New Roman" w:cs="Times New Roman"/>
@@ -17222,6 +17247,7 @@
           </w:tcPr>
           <w:p>
             <w:pPr>
+              <w:keepNext/>
               <w:jc w:val="center"/>
               <w:rPr>
                 <w:rFonts w:ascii="Times New Roman" w:eastAsia="Arial" w:hAnsi="Times New Roman" w:cs="Times New Roman"/>
@@ -17249,6 +17275,7 @@
           </w:tcPr>
           <w:p>
             <w:pPr>
+              <w:keepNext/>
               <w:jc w:val="center"/>
               <w:rPr>
                 <w:rFonts w:ascii="Times New Roman" w:eastAsia="Arial" w:hAnsi="Times New Roman" w:cs="Times New Roman"/>

</xml_diff>

<commit_message>
RPS Opto: sinkronkan CPL 3/5 & Bobot Komponen Penilaian ke sistem live
Verifikasi silang terprogram thd Asesmen JSON + Dokumen-OBE.html
(sumber data 6 screenshot dosen) menemukan 2 penyimpangan: (1) deskripsi
CPL 3 & CPL 5 beda kata tipis dari live (sudah ada di file asli dosen);
(2) baris Bobot(%) Komponen Penilaian masih placeholder template
(UTS=50/UAS=50/Tugas=kosong) padahal formula live Nilai-Akhir.html
pakai Tugas=60%/UTS=20%/UAS=20%. Keduanya direlabel ke nilai live.

Co-Authored-By: Claude Sonnet 5 <noreply@anthropic.com>
Claude-Session: https://claude.ai/code/session_01MRPE2Wfn5ruEpMsNER92uG
</commit_message>
<xml_diff>
--- a/Optimalisasi-dan-Automasi/Attributes/RPS Optimalisasi dan Otomasi.docx
+++ b/Optimalisasi-dan-Automasi/Attributes/RPS Optimalisasi dan Otomasi.docx
@@ -10815,7 +10815,7 @@
                       <w:szCs w:val="18"/>
                       <w:lang w:val="id-ID" w:eastAsia="en-ID"/>
                     </w:rPr>
-                    <w:t>Mampu menerapkan pemikiran logis, kritis, sistematis, kreatif dan inovatif dalam merancang komponen, sistem, dan/atau proses dengan pendekatan analisis perekayasa berbasis ilmu dan teknologi 4.0 dan mempertimbangkan standar teknis, aspek kinerja, keandalan, kemudahan penerapan, serta beberapa aspek terkait seperti aspek hukum, ekonomi, lingkungan, sosial, politik, kesehatan dan keselamatan dan juga untuk memanfaatkan potensi sumber daya lokal dan nasional dengan perspektif global dalam rangka menghasilkan solusi, gagasan, atau desain.</w:t>
+                    <w:t>Mampu menerapkan pemikiran logis, kritis, sistematis, kreatif dan inovatif dalam merancang komponen, sistem, dan/atau proses dengan pendekatan analisis perekayasa berbasis ilmu dan teknologi 4.0 dan mempertimbangkan standar teknis, aspek kinerja, keandalan, kemudahan penerapan, serta beberapa aspek terkait seperti aspek hukum, ekonomi, lingkungan, sosial, politik, kesehatan dan keselamatan dan juga untuk memanfaatkan potensi sumber daya lokal dan nasional dengan perspektif global dalam rangka menghasilkan solusi, gagasan, atau desain teknik.</w:t>
                   </w:r>
                 </w:p>
               </w:tc>
@@ -10949,7 +10949,7 @@
                       <w:szCs w:val="18"/>
                       <w:lang w:val="id-ID" w:eastAsia="en-ID"/>
                     </w:rPr>
-                    <w:t xml:space="preserve">Mampu mengidentifikasikan, memformulasikan, menganalisis dan menyelesaikan permasalahanpermasalahan teknik mesin yang kompleks serta mengkaji efisiensi kinerja sistem mekanikal dan melakukan perbaikan sistem yang dibutuhkan.</w:t>
+                    <w:t>Mampu mengidentifikasikan, memformulasikan, menganalisis dan menyelesaikan permasalahan-permasalahan teknik mesin yang kompleks serta mengkaji efisiensi kinerja sistem mekanikal dan melakukan perbaikan sistem yang dibutuhkan.</w:t>
                   </w:r>
                 </w:p>
               </w:tc>
@@ -14435,6 +14435,16 @@
                       <w:lang w:val="id-ID" w:eastAsia="en-ID"/>
                     </w:rPr>
                   </w:pPr>
+                  <w:r>
+                    <w:rPr>
+                      <w:rFonts w:ascii="Times New Roman" w:eastAsia="Times New Roman" w:hAnsi="Times New Roman" w:cs="Times New Roman"/>
+                      <w:color w:val="000000"/>
+                      <w:sz w:val="16"/>
+                      <w:szCs w:val="16"/>
+                      <w:lang w:val="id-ID" w:eastAsia="en-ID"/>
+                    </w:rPr>
+                    <w:t xml:space="preserve">60</w:t>
+                  </w:r>
                 </w:p>
               </w:tc>
               <w:tc>
@@ -14730,7 +14740,7 @@
                       <w:szCs w:val="16"/>
                       <w:lang w:val="id-ID" w:eastAsia="en-ID"/>
                     </w:rPr>
-                    <w:t>50</w:t>
+                    <w:t xml:space="preserve">20</w:t>
                   </w:r>
                 </w:p>
               </w:tc>
@@ -15195,7 +15205,7 @@
                       <w:szCs w:val="16"/>
                       <w:lang w:val="id-ID" w:eastAsia="en-ID"/>
                     </w:rPr>
-                    <w:t>50</w:t>
+                    <w:t xml:space="preserve">20</w:t>
                   </w:r>
                 </w:p>
               </w:tc>

</xml_diff>

<commit_message>
RPS Opto: sinkronkan CPL 3/5 & Bobot Komponen Penilaian ke sistem live (#658)
Verifikasi silang terprogram thd Asesmen JSON + Dokumen-OBE.html
(sumber data 6 screenshot dosen) menemukan 2 penyimpangan: (1) deskripsi
CPL 3 & CPL 5 beda kata tipis dari live (sudah ada di file asli dosen);
(2) baris Bobot(%) Komponen Penilaian masih placeholder template
(UTS=50/UAS=50/Tugas=kosong) padahal formula live Nilai-Akhir.html
pakai Tugas=60%/UTS=20%/UAS=20%. Keduanya direlabel ke nilai live.


Claude-Session: https://claude.ai/code/session_01MRPE2Wfn5ruEpMsNER92uG

Co-authored-by: Claude <noreply@anthropic.com>
</commit_message>
<xml_diff>
--- a/Optimalisasi-dan-Automasi/Attributes/RPS Optimalisasi dan Otomasi.docx
+++ b/Optimalisasi-dan-Automasi/Attributes/RPS Optimalisasi dan Otomasi.docx
@@ -10815,7 +10815,7 @@
                       <w:szCs w:val="18"/>
                       <w:lang w:val="id-ID" w:eastAsia="en-ID"/>
                     </w:rPr>
-                    <w:t>Mampu menerapkan pemikiran logis, kritis, sistematis, kreatif dan inovatif dalam merancang komponen, sistem, dan/atau proses dengan pendekatan analisis perekayasa berbasis ilmu dan teknologi 4.0 dan mempertimbangkan standar teknis, aspek kinerja, keandalan, kemudahan penerapan, serta beberapa aspek terkait seperti aspek hukum, ekonomi, lingkungan, sosial, politik, kesehatan dan keselamatan dan juga untuk memanfaatkan potensi sumber daya lokal dan nasional dengan perspektif global dalam rangka menghasilkan solusi, gagasan, atau desain.</w:t>
+                    <w:t>Mampu menerapkan pemikiran logis, kritis, sistematis, kreatif dan inovatif dalam merancang komponen, sistem, dan/atau proses dengan pendekatan analisis perekayasa berbasis ilmu dan teknologi 4.0 dan mempertimbangkan standar teknis, aspek kinerja, keandalan, kemudahan penerapan, serta beberapa aspek terkait seperti aspek hukum, ekonomi, lingkungan, sosial, politik, kesehatan dan keselamatan dan juga untuk memanfaatkan potensi sumber daya lokal dan nasional dengan perspektif global dalam rangka menghasilkan solusi, gagasan, atau desain teknik.</w:t>
                   </w:r>
                 </w:p>
               </w:tc>
@@ -10949,7 +10949,7 @@
                       <w:szCs w:val="18"/>
                       <w:lang w:val="id-ID" w:eastAsia="en-ID"/>
                     </w:rPr>
-                    <w:t xml:space="preserve">Mampu mengidentifikasikan, memformulasikan, menganalisis dan menyelesaikan permasalahanpermasalahan teknik mesin yang kompleks serta mengkaji efisiensi kinerja sistem mekanikal dan melakukan perbaikan sistem yang dibutuhkan.</w:t>
+                    <w:t>Mampu mengidentifikasikan, memformulasikan, menganalisis dan menyelesaikan permasalahan-permasalahan teknik mesin yang kompleks serta mengkaji efisiensi kinerja sistem mekanikal dan melakukan perbaikan sistem yang dibutuhkan.</w:t>
                   </w:r>
                 </w:p>
               </w:tc>
@@ -14435,6 +14435,16 @@
                       <w:lang w:val="id-ID" w:eastAsia="en-ID"/>
                     </w:rPr>
                   </w:pPr>
+                  <w:r>
+                    <w:rPr>
+                      <w:rFonts w:ascii="Times New Roman" w:eastAsia="Times New Roman" w:hAnsi="Times New Roman" w:cs="Times New Roman"/>
+                      <w:color w:val="000000"/>
+                      <w:sz w:val="16"/>
+                      <w:szCs w:val="16"/>
+                      <w:lang w:val="id-ID" w:eastAsia="en-ID"/>
+                    </w:rPr>
+                    <w:t xml:space="preserve">60</w:t>
+                  </w:r>
                 </w:p>
               </w:tc>
               <w:tc>
@@ -14730,7 +14740,7 @@
                       <w:szCs w:val="16"/>
                       <w:lang w:val="id-ID" w:eastAsia="en-ID"/>
                     </w:rPr>
-                    <w:t>50</w:t>
+                    <w:t xml:space="preserve">20</w:t>
                   </w:r>
                 </w:p>
               </w:tc>
@@ -15195,7 +15205,7 @@
                       <w:szCs w:val="16"/>
                       <w:lang w:val="id-ID" w:eastAsia="en-ID"/>
                     </w:rPr>
-                    <w:t>50</w:t>
+                    <w:t xml:space="preserve">20</w:t>
                   </w:r>
                 </w:p>
               </w:tc>

</xml_diff>

<commit_message>
RPS Opto: tambahkan tanda tangan Otorisasi/Pengesahan (3 pihak)
Tanda tangan Dosen Pengemban RPS (Dedik Romahadi), Koordinator Mata
Kuliah (Hadi Pranoto), dan Ketua Program Studi (Imam Hidayat)
ditempel di atas nama masing-masing pada tabel Otorisasi/Pengesahan,
diskalakan proporsional terhadap lebar kolom.

Co-Authored-By: Claude Sonnet 5 <noreply@anthropic.com>
Claude-Session: https://claude.ai/code/session_01MRPE2Wfn5ruEpMsNER92uG
</commit_message>
<xml_diff>
--- a/Optimalisasi-dan-Automasi/Attributes/RPS Optimalisasi dan Otomasi.docx
+++ b/Optimalisasi-dan-Automasi/Attributes/RPS Optimalisasi dan Otomasi.docx
@@ -9921,6 +9921,40 @@
                 <w:lang w:val="id-ID" w:eastAsia="en-ID"/>
               </w:rPr>
             </w:pPr>
+            <w:r>
+              <w:drawing>
+                <wp:inline xmlns:a="http://schemas.openxmlformats.org/drawingml/2006/main" xmlns:pic="http://schemas.openxmlformats.org/drawingml/2006/picture">
+                  <wp:extent cx="1152000" cy="1023726"/>
+                  <wp:docPr id="815499149" name="Picture 815499149"/>
+                  <wp:cNvGraphicFramePr>
+                    <a:graphicFrameLocks noChangeAspect="1"/>
+                  </wp:cNvGraphicFramePr>
+                  <a:graphic>
+                    <a:graphicData uri="http://schemas.openxmlformats.org/drawingml/2006/picture">
+                      <pic:pic>
+                        <pic:nvPicPr>
+                          <pic:cNvPr id="0" name="sig_dosen_pengemban.png"/>
+                          <pic:cNvPicPr/>
+                        </pic:nvPicPr>
+                        <pic:blipFill>
+                          <a:blip r:embed="rId17"/>
+                          <a:stretch>
+                            <a:fillRect/>
+                          </a:stretch>
+                        </pic:blipFill>
+                        <pic:spPr>
+                          <a:xfrm>
+                            <a:off x="0" y="0"/>
+                            <a:ext cx="1152000" cy="1023726"/>
+                          </a:xfrm>
+                          <a:prstGeom prst="rect"/>
+                        </pic:spPr>
+                      </pic:pic>
+                    </a:graphicData>
+                  </a:graphic>
+                </wp:inline>
+              </w:drawing>
+            </w:r>
           </w:p>
           <w:p>
             <w:pPr>
@@ -10048,6 +10082,40 @@
                 <w:lang w:val="id-ID" w:eastAsia="en-ID"/>
               </w:rPr>
             </w:pPr>
+            <w:r>
+              <w:drawing>
+                <wp:inline xmlns:a="http://schemas.openxmlformats.org/drawingml/2006/main" xmlns:pic="http://schemas.openxmlformats.org/drawingml/2006/picture">
+                  <wp:extent cx="1080000" cy="317106"/>
+                  <wp:docPr id="815499150" name="Picture 815499150"/>
+                  <wp:cNvGraphicFramePr>
+                    <a:graphicFrameLocks noChangeAspect="1"/>
+                  </wp:cNvGraphicFramePr>
+                  <a:graphic>
+                    <a:graphicData uri="http://schemas.openxmlformats.org/drawingml/2006/picture">
+                      <pic:pic>
+                        <pic:nvPicPr>
+                          <pic:cNvPr id="0" name="sig_koordinator.png"/>
+                          <pic:cNvPicPr/>
+                        </pic:nvPicPr>
+                        <pic:blipFill>
+                          <a:blip r:embed="rId18"/>
+                          <a:stretch>
+                            <a:fillRect/>
+                          </a:stretch>
+                        </pic:blipFill>
+                        <pic:spPr>
+                          <a:xfrm>
+                            <a:off x="0" y="0"/>
+                            <a:ext cx="1080000" cy="317106"/>
+                          </a:xfrm>
+                          <a:prstGeom prst="rect"/>
+                        </pic:spPr>
+                      </pic:pic>
+                    </a:graphicData>
+                  </a:graphic>
+                </wp:inline>
+              </w:drawing>
+            </w:r>
           </w:p>
           <w:p>
             <w:pPr>
@@ -10132,6 +10200,40 @@
                 <w:lang w:val="id-ID" w:eastAsia="en-ID"/>
               </w:rPr>
             </w:pPr>
+            <w:r>
+              <w:drawing>
+                <wp:inline xmlns:a="http://schemas.openxmlformats.org/drawingml/2006/main" xmlns:pic="http://schemas.openxmlformats.org/drawingml/2006/picture">
+                  <wp:extent cx="936000" cy="436228"/>
+                  <wp:docPr id="815499151" name="Picture 815499151"/>
+                  <wp:cNvGraphicFramePr>
+                    <a:graphicFrameLocks noChangeAspect="1"/>
+                  </wp:cNvGraphicFramePr>
+                  <a:graphic>
+                    <a:graphicData uri="http://schemas.openxmlformats.org/drawingml/2006/picture">
+                      <pic:pic>
+                        <pic:nvPicPr>
+                          <pic:cNvPr id="0" name="sig_ketua_prodi.png"/>
+                          <pic:cNvPicPr/>
+                        </pic:nvPicPr>
+                        <pic:blipFill>
+                          <a:blip r:embed="rId19"/>
+                          <a:stretch>
+                            <a:fillRect/>
+                          </a:stretch>
+                        </pic:blipFill>
+                        <pic:spPr>
+                          <a:xfrm>
+                            <a:off x="0" y="0"/>
+                            <a:ext cx="936000" cy="436228"/>
+                          </a:xfrm>
+                          <a:prstGeom prst="rect"/>
+                        </pic:spPr>
+                      </pic:pic>
+                    </a:graphicData>
+                  </a:graphic>
+                </wp:inline>
+              </w:drawing>
+            </w:r>
           </w:p>
           <w:p>
             <w:pPr>

</xml_diff>

<commit_message>
RPS Opto: tambahkan tanda tangan Otorisasi/Pengesahan (3 pihak) (#659)
Tanda tangan Dosen Pengemban RPS (Dedik Romahadi), Koordinator Mata
Kuliah (Hadi Pranoto), dan Ketua Program Studi (Imam Hidayat)
ditempel di atas nama masing-masing pada tabel Otorisasi/Pengesahan,
diskalakan proporsional terhadap lebar kolom.


Claude-Session: https://claude.ai/code/session_01MRPE2Wfn5ruEpMsNER92uG

Co-authored-by: Claude <noreply@anthropic.com>
</commit_message>
<xml_diff>
--- a/Optimalisasi-dan-Automasi/Attributes/RPS Optimalisasi dan Otomasi.docx
+++ b/Optimalisasi-dan-Automasi/Attributes/RPS Optimalisasi dan Otomasi.docx
@@ -9921,6 +9921,40 @@
                 <w:lang w:val="id-ID" w:eastAsia="en-ID"/>
               </w:rPr>
             </w:pPr>
+            <w:r>
+              <w:drawing>
+                <wp:inline xmlns:a="http://schemas.openxmlformats.org/drawingml/2006/main" xmlns:pic="http://schemas.openxmlformats.org/drawingml/2006/picture">
+                  <wp:extent cx="1152000" cy="1023726"/>
+                  <wp:docPr id="815499149" name="Picture 815499149"/>
+                  <wp:cNvGraphicFramePr>
+                    <a:graphicFrameLocks noChangeAspect="1"/>
+                  </wp:cNvGraphicFramePr>
+                  <a:graphic>
+                    <a:graphicData uri="http://schemas.openxmlformats.org/drawingml/2006/picture">
+                      <pic:pic>
+                        <pic:nvPicPr>
+                          <pic:cNvPr id="0" name="sig_dosen_pengemban.png"/>
+                          <pic:cNvPicPr/>
+                        </pic:nvPicPr>
+                        <pic:blipFill>
+                          <a:blip r:embed="rId17"/>
+                          <a:stretch>
+                            <a:fillRect/>
+                          </a:stretch>
+                        </pic:blipFill>
+                        <pic:spPr>
+                          <a:xfrm>
+                            <a:off x="0" y="0"/>
+                            <a:ext cx="1152000" cy="1023726"/>
+                          </a:xfrm>
+                          <a:prstGeom prst="rect"/>
+                        </pic:spPr>
+                      </pic:pic>
+                    </a:graphicData>
+                  </a:graphic>
+                </wp:inline>
+              </w:drawing>
+            </w:r>
           </w:p>
           <w:p>
             <w:pPr>
@@ -10048,6 +10082,40 @@
                 <w:lang w:val="id-ID" w:eastAsia="en-ID"/>
               </w:rPr>
             </w:pPr>
+            <w:r>
+              <w:drawing>
+                <wp:inline xmlns:a="http://schemas.openxmlformats.org/drawingml/2006/main" xmlns:pic="http://schemas.openxmlformats.org/drawingml/2006/picture">
+                  <wp:extent cx="1080000" cy="317106"/>
+                  <wp:docPr id="815499150" name="Picture 815499150"/>
+                  <wp:cNvGraphicFramePr>
+                    <a:graphicFrameLocks noChangeAspect="1"/>
+                  </wp:cNvGraphicFramePr>
+                  <a:graphic>
+                    <a:graphicData uri="http://schemas.openxmlformats.org/drawingml/2006/picture">
+                      <pic:pic>
+                        <pic:nvPicPr>
+                          <pic:cNvPr id="0" name="sig_koordinator.png"/>
+                          <pic:cNvPicPr/>
+                        </pic:nvPicPr>
+                        <pic:blipFill>
+                          <a:blip r:embed="rId18"/>
+                          <a:stretch>
+                            <a:fillRect/>
+                          </a:stretch>
+                        </pic:blipFill>
+                        <pic:spPr>
+                          <a:xfrm>
+                            <a:off x="0" y="0"/>
+                            <a:ext cx="1080000" cy="317106"/>
+                          </a:xfrm>
+                          <a:prstGeom prst="rect"/>
+                        </pic:spPr>
+                      </pic:pic>
+                    </a:graphicData>
+                  </a:graphic>
+                </wp:inline>
+              </w:drawing>
+            </w:r>
           </w:p>
           <w:p>
             <w:pPr>
@@ -10132,6 +10200,40 @@
                 <w:lang w:val="id-ID" w:eastAsia="en-ID"/>
               </w:rPr>
             </w:pPr>
+            <w:r>
+              <w:drawing>
+                <wp:inline xmlns:a="http://schemas.openxmlformats.org/drawingml/2006/main" xmlns:pic="http://schemas.openxmlformats.org/drawingml/2006/picture">
+                  <wp:extent cx="936000" cy="436228"/>
+                  <wp:docPr id="815499151" name="Picture 815499151"/>
+                  <wp:cNvGraphicFramePr>
+                    <a:graphicFrameLocks noChangeAspect="1"/>
+                  </wp:cNvGraphicFramePr>
+                  <a:graphic>
+                    <a:graphicData uri="http://schemas.openxmlformats.org/drawingml/2006/picture">
+                      <pic:pic>
+                        <pic:nvPicPr>
+                          <pic:cNvPr id="0" name="sig_ketua_prodi.png"/>
+                          <pic:cNvPicPr/>
+                        </pic:nvPicPr>
+                        <pic:blipFill>
+                          <a:blip r:embed="rId19"/>
+                          <a:stretch>
+                            <a:fillRect/>
+                          </a:stretch>
+                        </pic:blipFill>
+                        <pic:spPr>
+                          <a:xfrm>
+                            <a:off x="0" y="0"/>
+                            <a:ext cx="936000" cy="436228"/>
+                          </a:xfrm>
+                          <a:prstGeom prst="rect"/>
+                        </pic:spPr>
+                      </pic:pic>
+                    </a:graphicData>
+                  </a:graphic>
+                </wp:inline>
+              </w:drawing>
+            </w:r>
           </w:p>
           <w:p>
             <w:pPr>

</xml_diff>

<commit_message>
RPS Opto: pusatkan TTD Dosen Pengemban RPS, perbesar TTD Koordinator & Ketua Prodi
Blok TTD+nama di sel Dosen Pengemban RPS mepet ke bawah (3 nama di sel
itu membuatnya paling tinggi di baris, jadi tidak ada slack sisa untuk
vAlign=center bekerja) -- diperbaiki dengan meredistribusi paragraf
kosong dari 4-atas/0-bawah ke 2-atas/2-bawah. TTD Koordinator (3.0->5.0cm)
dan Ketua Prodi (2.6->4.0cm) diperbesar supaya tinggi render mendekati
TTD Dosen, mengoreksi aspect ratio yang jauh berbeda antar signature.

Co-Authored-By: Claude Sonnet 5 <noreply@anthropic.com>
Claude-Session: https://claude.ai/code/session_01MRPE2Wfn5ruEpMsNER92uG
</commit_message>
<xml_diff>
--- a/Optimalisasi-dan-Automasi/Attributes/RPS Optimalisasi dan Otomasi.docx
+++ b/Optimalisasi-dan-Automasi/Attributes/RPS Optimalisasi dan Otomasi.docx
@@ -9895,32 +9895,6 @@
                 <w:lang w:val="id-ID" w:eastAsia="en-ID"/>
               </w:rPr>
             </w:pPr>
-          </w:p>
-          <w:p>
-            <w:pPr>
-              <w:widowControl w:val="0"/>
-              <w:spacing w:after="0" w:line="240" w:lineRule="auto"/>
-              <w:jc w:val="center"/>
-              <w:rPr>
-                <w:rFonts w:ascii="Times New Roman" w:eastAsia="Times New Roman" w:hAnsi="Times New Roman" w:cs="Times New Roman"/>
-                <w:sz w:val="18"/>
-                <w:szCs w:val="18"/>
-                <w:lang w:val="id-ID" w:eastAsia="en-ID"/>
-              </w:rPr>
-            </w:pPr>
-          </w:p>
-          <w:p>
-            <w:pPr>
-              <w:widowControl w:val="0"/>
-              <w:spacing w:after="0" w:line="240" w:lineRule="auto"/>
-              <w:jc w:val="center"/>
-              <w:rPr>
-                <w:rFonts w:ascii="Times New Roman" w:eastAsia="Times New Roman" w:hAnsi="Times New Roman" w:cs="Times New Roman"/>
-                <w:sz w:val="18"/>
-                <w:szCs w:val="18"/>
-                <w:lang w:val="id-ID" w:eastAsia="en-ID"/>
-              </w:rPr>
-            </w:pPr>
             <w:r>
               <w:drawing>
                 <wp:inline xmlns:a="http://schemas.openxmlformats.org/drawingml/2006/main" xmlns:pic="http://schemas.openxmlformats.org/drawingml/2006/picture">
@@ -10022,6 +9996,32 @@
               <w:t xml:space="preserve">Rikko Putra Youlia, ST., M.Eng</w:t>
             </w:r>
           </w:p>
+          <w:p>
+            <w:pPr>
+              <w:widowControl w:val="0"/>
+              <w:spacing w:after="0" w:line="240" w:lineRule="auto"/>
+              <w:jc w:val="center"/>
+              <w:rPr>
+                <w:rFonts w:ascii="Times New Roman" w:eastAsia="Times New Roman" w:hAnsi="Times New Roman" w:cs="Times New Roman"/>
+                <w:sz w:val="18"/>
+                <w:szCs w:val="18"/>
+                <w:lang w:val="id-ID" w:eastAsia="en-ID"/>
+              </w:rPr>
+            </w:pPr>
+          </w:p>
+          <w:p>
+            <w:pPr>
+              <w:widowControl w:val="0"/>
+              <w:spacing w:after="0" w:line="240" w:lineRule="auto"/>
+              <w:jc w:val="center"/>
+              <w:rPr>
+                <w:rFonts w:ascii="Times New Roman" w:eastAsia="Times New Roman" w:hAnsi="Times New Roman" w:cs="Times New Roman"/>
+                <w:sz w:val="18"/>
+                <w:szCs w:val="18"/>
+                <w:lang w:val="id-ID" w:eastAsia="en-ID"/>
+              </w:rPr>
+            </w:pPr>
+          </w:p>
         </w:tc>
         <w:tc>
           <w:tcPr>
@@ -10085,7 +10085,7 @@
             <w:r>
               <w:drawing>
                 <wp:inline xmlns:a="http://schemas.openxmlformats.org/drawingml/2006/main" xmlns:pic="http://schemas.openxmlformats.org/drawingml/2006/picture">
-                  <wp:extent cx="1080000" cy="317106"/>
+                  <wp:extent cx="1800000" cy="528511"/>
                   <wp:docPr id="815499150" name="Picture 815499150"/>
                   <wp:cNvGraphicFramePr>
                     <a:graphicFrameLocks noChangeAspect="1"/>
@@ -10106,7 +10106,7 @@
                         <pic:spPr>
                           <a:xfrm>
                             <a:off x="0" y="0"/>
-                            <a:ext cx="1080000" cy="317106"/>
+                            <a:ext cx="1800000" cy="528511"/>
                           </a:xfrm>
                           <a:prstGeom prst="rect"/>
                         </pic:spPr>
@@ -10203,7 +10203,7 @@
             <w:r>
               <w:drawing>
                 <wp:inline xmlns:a="http://schemas.openxmlformats.org/drawingml/2006/main" xmlns:pic="http://schemas.openxmlformats.org/drawingml/2006/picture">
-                  <wp:extent cx="936000" cy="436228"/>
+                  <wp:extent cx="1440000" cy="671119"/>
                   <wp:docPr id="815499151" name="Picture 815499151"/>
                   <wp:cNvGraphicFramePr>
                     <a:graphicFrameLocks noChangeAspect="1"/>
@@ -10224,7 +10224,7 @@
                         <pic:spPr>
                           <a:xfrm>
                             <a:off x="0" y="0"/>
-                            <a:ext cx="936000" cy="436228"/>
+                            <a:ext cx="1440000" cy="671119"/>
                           </a:xfrm>
                           <a:prstGeom prst="rect"/>
                         </pic:spPr>

</xml_diff>

<commit_message>
RPS Opto: pusatkan TTD Dosen Pengemban RPS, perbesar TTD Koordinator & Ketua Prodi (#660)
Blok TTD+nama di sel Dosen Pengemban RPS mepet ke bawah (3 nama di sel
itu membuatnya paling tinggi di baris, jadi tidak ada slack sisa untuk
vAlign=center bekerja) -- diperbaiki dengan meredistribusi paragraf
kosong dari 4-atas/0-bawah ke 2-atas/2-bawah. TTD Koordinator (3.0->5.0cm)
dan Ketua Prodi (2.6->4.0cm) diperbesar supaya tinggi render mendekati
TTD Dosen, mengoreksi aspect ratio yang jauh berbeda antar signature.


Claude-Session: https://claude.ai/code/session_01MRPE2Wfn5ruEpMsNER92uG

Co-authored-by: Claude <noreply@anthropic.com>
</commit_message>
<xml_diff>
--- a/Optimalisasi-dan-Automasi/Attributes/RPS Optimalisasi dan Otomasi.docx
+++ b/Optimalisasi-dan-Automasi/Attributes/RPS Optimalisasi dan Otomasi.docx
@@ -9895,32 +9895,6 @@
                 <w:lang w:val="id-ID" w:eastAsia="en-ID"/>
               </w:rPr>
             </w:pPr>
-          </w:p>
-          <w:p>
-            <w:pPr>
-              <w:widowControl w:val="0"/>
-              <w:spacing w:after="0" w:line="240" w:lineRule="auto"/>
-              <w:jc w:val="center"/>
-              <w:rPr>
-                <w:rFonts w:ascii="Times New Roman" w:eastAsia="Times New Roman" w:hAnsi="Times New Roman" w:cs="Times New Roman"/>
-                <w:sz w:val="18"/>
-                <w:szCs w:val="18"/>
-                <w:lang w:val="id-ID" w:eastAsia="en-ID"/>
-              </w:rPr>
-            </w:pPr>
-          </w:p>
-          <w:p>
-            <w:pPr>
-              <w:widowControl w:val="0"/>
-              <w:spacing w:after="0" w:line="240" w:lineRule="auto"/>
-              <w:jc w:val="center"/>
-              <w:rPr>
-                <w:rFonts w:ascii="Times New Roman" w:eastAsia="Times New Roman" w:hAnsi="Times New Roman" w:cs="Times New Roman"/>
-                <w:sz w:val="18"/>
-                <w:szCs w:val="18"/>
-                <w:lang w:val="id-ID" w:eastAsia="en-ID"/>
-              </w:rPr>
-            </w:pPr>
             <w:r>
               <w:drawing>
                 <wp:inline xmlns:a="http://schemas.openxmlformats.org/drawingml/2006/main" xmlns:pic="http://schemas.openxmlformats.org/drawingml/2006/picture">
@@ -10022,6 +9996,32 @@
               <w:t xml:space="preserve">Rikko Putra Youlia, ST., M.Eng</w:t>
             </w:r>
           </w:p>
+          <w:p>
+            <w:pPr>
+              <w:widowControl w:val="0"/>
+              <w:spacing w:after="0" w:line="240" w:lineRule="auto"/>
+              <w:jc w:val="center"/>
+              <w:rPr>
+                <w:rFonts w:ascii="Times New Roman" w:eastAsia="Times New Roman" w:hAnsi="Times New Roman" w:cs="Times New Roman"/>
+                <w:sz w:val="18"/>
+                <w:szCs w:val="18"/>
+                <w:lang w:val="id-ID" w:eastAsia="en-ID"/>
+              </w:rPr>
+            </w:pPr>
+          </w:p>
+          <w:p>
+            <w:pPr>
+              <w:widowControl w:val="0"/>
+              <w:spacing w:after="0" w:line="240" w:lineRule="auto"/>
+              <w:jc w:val="center"/>
+              <w:rPr>
+                <w:rFonts w:ascii="Times New Roman" w:eastAsia="Times New Roman" w:hAnsi="Times New Roman" w:cs="Times New Roman"/>
+                <w:sz w:val="18"/>
+                <w:szCs w:val="18"/>
+                <w:lang w:val="id-ID" w:eastAsia="en-ID"/>
+              </w:rPr>
+            </w:pPr>
+          </w:p>
         </w:tc>
         <w:tc>
           <w:tcPr>
@@ -10085,7 +10085,7 @@
             <w:r>
               <w:drawing>
                 <wp:inline xmlns:a="http://schemas.openxmlformats.org/drawingml/2006/main" xmlns:pic="http://schemas.openxmlformats.org/drawingml/2006/picture">
-                  <wp:extent cx="1080000" cy="317106"/>
+                  <wp:extent cx="1800000" cy="528511"/>
                   <wp:docPr id="815499150" name="Picture 815499150"/>
                   <wp:cNvGraphicFramePr>
                     <a:graphicFrameLocks noChangeAspect="1"/>
@@ -10106,7 +10106,7 @@
                         <pic:spPr>
                           <a:xfrm>
                             <a:off x="0" y="0"/>
-                            <a:ext cx="1080000" cy="317106"/>
+                            <a:ext cx="1800000" cy="528511"/>
                           </a:xfrm>
                           <a:prstGeom prst="rect"/>
                         </pic:spPr>
@@ -10203,7 +10203,7 @@
             <w:r>
               <w:drawing>
                 <wp:inline xmlns:a="http://schemas.openxmlformats.org/drawingml/2006/main" xmlns:pic="http://schemas.openxmlformats.org/drawingml/2006/picture">
-                  <wp:extent cx="936000" cy="436228"/>
+                  <wp:extent cx="1440000" cy="671119"/>
                   <wp:docPr id="815499151" name="Picture 815499151"/>
                   <wp:cNvGraphicFramePr>
                     <a:graphicFrameLocks noChangeAspect="1"/>
@@ -10224,7 +10224,7 @@
                         <pic:spPr>
                           <a:xfrm>
                             <a:off x="0" y="0"/>
-                            <a:ext cx="936000" cy="436228"/>
+                            <a:ext cx="1440000" cy="671119"/>
                           </a:xfrm>
                           <a:prstGeom prst="rect"/>
                         </pic:spPr>

</xml_diff>